<commit_message>
Rolodex job cards, skill-match gate, rejected-job feedback loop, remote-detection fix
- skills.html: replace the side detail panel with a fanned rolodex card stack
  (front + 2 neighbors in DOM, click/swipe/arrow/Escape nav).
- agent: MIN_SKILL_MATCHES gate drops jobs with <3 matched skills from the
  digest/graph; agent/rejected.py mirrors applied.py (CA-REJECTED mailto +
  IMAP sync) and feeds a Rocchio negative centroid in rank.py so rejected
  postings suppress structurally similar future ones.
- fetch_jobs/util: looks_genuinely_remote() replaces the naive "remote"
  substring check and rejects hybrid/onsite/relocation phrasing; fetch_all()
  drops any non-remote job as defense in depth.
- current_resume.docx resynced from resume.html (was missing the current role).

Co-Authored-By: Claude Sonnet 5 <noreply@anthropic.com>
</commit_message>
<xml_diff>
--- a/current_resume.docx
+++ b/current_resume.docx
@@ -31,7 +31,7 @@
           <w:sz w:val="19"/>
           <w:szCs w:val="19"/>
         </w:rPr>
-        <w:t xml:space="preserve">McLean, VA  |  216-904-9535  |  mbf.louard@gmail.com</w:t>
+        <w:t>Raleigh, NC  |  216-904-9535  |  mbf.louard@gmail.com  |  linkedin.com/in/michael-louard  |  github.com/agentchieflou</w:t>
       </w:r>
     </w:p>
     <w:p>
@@ -73,15 +73,15 @@
           <w:sz w:val="20"/>
           <w:szCs w:val="20"/>
         </w:rPr>
-        <w:t xml:space="preserve">Languages &amp; Tools: </w:t>
-      </w:r>
-      <w:r>
-        <w:rPr>
-          <w:rFonts w:ascii="Arial" w:cs="Arial" w:eastAsia="Arial" w:hAnsi="Arial"/>
-          <w:sz w:val="20"/>
-          <w:szCs w:val="20"/>
-        </w:rPr>
-        <w:t xml:space="preserve">Python, R, SAS, Stata, SQL, PySpark, Go (exposure), COBOL (translation)</w:t>
+        <w:t xml:space="preserve">Languages &amp; Automation: </w:t>
+      </w:r>
+      <w:r>
+        <w:rPr>
+          <w:rFonts w:ascii="Arial" w:cs="Arial" w:eastAsia="Arial" w:hAnsi="Arial"/>
+          <w:sz w:val="20"/>
+          <w:szCs w:val="20"/>
+        </w:rPr>
+        <w:t>Python, R, SAS, Stata, SQL, PySpark, Go (exposure), COBOL (translation), Selenium, Headless Browsers</w:t>
       </w:r>
     </w:p>
     <w:p>
@@ -104,7 +104,7 @@
           <w:sz w:val="20"/>
           <w:szCs w:val="20"/>
         </w:rPr>
-        <w:t xml:space="preserve">Kubernetes / OpenShift, Helm, CI/CD pipelines, Hadoop, Power BI, Excel</w:t>
+        <w:t>Kubernetes / OpenShift, Helm, CI/CD pipelines, Docker, Hadoop, Power BI, Excel</w:t>
       </w:r>
     </w:p>
     <w:p>
@@ -119,15 +119,15 @@
           <w:sz w:val="20"/>
           <w:szCs w:val="20"/>
         </w:rPr>
-        <w:t xml:space="preserve">Competencies: </w:t>
-      </w:r>
-      <w:r>
-        <w:rPr>
-          <w:rFonts w:ascii="Arial" w:cs="Arial" w:eastAsia="Arial" w:hAnsi="Arial"/>
-          <w:sz w:val="20"/>
-          <w:szCs w:val="20"/>
-        </w:rPr>
-        <w:t xml:space="preserve">API Development, NLP / BERT Modeling, Quantitative Analytics, Credit Risk Modeling, CECL Forecasting, Mainframe Migration, Data Visualization</w:t>
+        <w:t xml:space="preserve">Core Competencies: </w:t>
+      </w:r>
+      <w:r>
+        <w:rPr>
+          <w:rFonts w:ascii="Arial" w:cs="Arial" w:eastAsia="Arial" w:hAnsi="Arial"/>
+          <w:sz w:val="20"/>
+          <w:szCs w:val="20"/>
+        </w:rPr>
+        <w:t>API Development, NLP / BERT, Agentic &amp; RAG Strategy, Quantitative Analytics, CECL Forecasting, Mainframe Migrations, Telemetry &amp; Analytics</w:t>
       </w:r>
     </w:p>
     <w:p>
@@ -165,7 +165,7 @@
           <w:sz w:val="22"/>
           <w:szCs w:val="22"/>
         </w:rPr>
-        <w:t xml:space="preserve">PNC Bank</w:t>
+        <w:t>PNC Bank</w:t>
       </w:r>
       <w:r>
         <w:rPr>
@@ -176,6 +176,141 @@
           <w:sz w:val="22"/>
           <w:szCs w:val="22"/>
         </w:rPr>
+        <w:t xml:space="preserve"> | Business Analytics Consultant</w:t>
+      </w:r>
+      <w:r>
+        <w:rPr>
+          <w:rFonts w:ascii="Arial" w:cs="Arial" w:eastAsia="Arial" w:hAnsi="Arial"/>
+          <w:color w:val="555555"/>
+          <w:sz w:val="20"/>
+          <w:szCs w:val="20"/>
+        </w:rPr>
+        <w:tab/>
+        <w:t>Raleigh, NC  |  Nov 2025 – Present</w:t>
+      </w:r>
+    </w:p>
+    <w:p>
+      <w:pPr>
+        <w:pStyle w:val="ListParagraph"/>
+        <w:numPr>
+          <w:ilvl w:val="0"/>
+          <w:numId w:val="2"/>
+        </w:numPr>
+        <w:spacing w:after="30" w:before="30"/>
+      </w:pPr>
+      <w:r>
+        <w:rPr>
+          <w:rFonts w:ascii="Arial" w:cs="Arial" w:eastAsia="Arial" w:hAnsi="Arial"/>
+          <w:color w:val="222222"/>
+          <w:sz w:val="20"/>
+          <w:szCs w:val="20"/>
+        </w:rPr>
+        <w:t>Legacy Mainframe Migration: Designed and implemented a parameterized data validation framework to compare and reconcile outputs across MongoDB, SOM DI, and OLNACS during a major asset class migration. Enabled SME validation of 1,930 data fields, including 443 migration-impacted mappings and 207 business-critical fields, supporting on-time project delivery, avoiding a $30M contract renewal.</w:t>
+      </w:r>
+    </w:p>
+    <w:p>
+      <w:pPr>
+        <w:pStyle w:val="ListParagraph"/>
+        <w:numPr>
+          <w:ilvl w:val="0"/>
+          <w:numId w:val="2"/>
+        </w:numPr>
+        <w:spacing w:after="30" w:before="30"/>
+      </w:pPr>
+      <w:r>
+        <w:rPr>
+          <w:rFonts w:ascii="Arial" w:cs="Arial" w:eastAsia="Arial" w:hAnsi="Arial"/>
+          <w:color w:val="222222"/>
+          <w:sz w:val="20"/>
+          <w:szCs w:val="20"/>
+        </w:rPr>
+        <w:t>Document Sourcing Automation: Developed a multi-scraper Python automation suite managed by a master orchestrator to retrieve loan files, successfully closing out Document Process Management (DPM) issues; engineered a proof-of-concept using Selenium before transitioning to a high-throughput API headless browser connection.</w:t>
+      </w:r>
+    </w:p>
+    <w:p>
+      <w:pPr>
+        <w:pStyle w:val="ListParagraph"/>
+        <w:numPr>
+          <w:ilvl w:val="0"/>
+          <w:numId w:val="2"/>
+        </w:numPr>
+        <w:spacing w:after="30" w:before="30"/>
+      </w:pPr>
+      <w:r>
+        <w:rPr>
+          <w:rFonts w:ascii="Arial" w:cs="Arial" w:eastAsia="Arial" w:hAnsi="Arial"/>
+          <w:color w:val="222222"/>
+          <w:sz w:val="20"/>
+          <w:szCs w:val="20"/>
+        </w:rPr>
+        <w:t>Telemetry &amp; Usage Analytics: Designed and developed grid-wide database telemetry and table-level usage analytics that eliminated weeks of manual impact analysis for migrations and maintenance events. Enabled DBAs and senior analysts to rapidly identify affected databases, accelerating migration planning from weeks to days and reducing time spent on manual discovery.</w:t>
+      </w:r>
+    </w:p>
+    <w:p>
+      <w:pPr>
+        <w:pStyle w:val="ListParagraph"/>
+        <w:numPr>
+          <w:ilvl w:val="0"/>
+          <w:numId w:val="2"/>
+        </w:numPr>
+        <w:spacing w:after="30" w:before="30"/>
+      </w:pPr>
+      <w:r>
+        <w:rPr>
+          <w:rFonts w:ascii="Arial" w:cs="Arial" w:eastAsia="Arial" w:hAnsi="Arial"/>
+          <w:color w:val="222222"/>
+          <w:sz w:val="20"/>
+          <w:szCs w:val="20"/>
+        </w:rPr>
+        <w:t>REST API Deployment: Currently containerizing custom scrapers and data parsing systems to deploy them as new hosted REST APIs on OpenShift.</w:t>
+      </w:r>
+    </w:p>
+    <w:p>
+      <w:pPr>
+        <w:pStyle w:val="ListParagraph"/>
+        <w:numPr>
+          <w:ilvl w:val="0"/>
+          <w:numId w:val="2"/>
+        </w:numPr>
+        <w:spacing w:after="30" w:before="30"/>
+      </w:pPr>
+      <w:r>
+        <w:rPr>
+          <w:rFonts w:ascii="Arial" w:cs="Arial" w:eastAsia="Arial" w:hAnsi="Arial"/>
+          <w:color w:val="222222"/>
+          <w:sz w:val="20"/>
+          <w:szCs w:val="20"/>
+        </w:rPr>
+        <w:t>AI Strategy &amp; Research: Researched and evaluated agentic workflows, RAG architectures, and enterprise AI design patterns. Delivered internal demonstrations and recommendations focused on resource-efficient implementations under strict enterprise security and token constraints.</w:t>
+      </w:r>
+    </w:p>
+    <w:p>
+      <w:pPr>
+        <w:tabs>
+          <w:tab w:val="right" w:pos="9026"/>
+        </w:tabs>
+        <w:spacing w:after="20" w:before="140"/>
+      </w:pPr>
+      <w:r>
+        <w:rPr>
+          <w:rFonts w:ascii="Arial" w:cs="Arial" w:eastAsia="Arial" w:hAnsi="Arial"/>
+          <w:b/>
+          <w:bCs/>
+          <w:color w:val="1F3864"/>
+          <w:sz w:val="22"/>
+          <w:szCs w:val="22"/>
+        </w:rPr>
+        <w:t xml:space="preserve">PNC Bank</w:t>
+      </w:r>
+      <w:r>
+        <w:rPr>
+          <w:rFonts w:ascii="Arial" w:cs="Arial" w:eastAsia="Arial" w:hAnsi="Arial"/>
+          <w:b w:val="false"/>
+          <w:bCs w:val="false"/>
+          <w:color w:val="555555"/>
+          <w:sz w:val="22"/>
+          <w:szCs w:val="22"/>
+        </w:rPr>
         <w:t xml:space="preserve"> | Quantitative Analytics – Model Development &amp; Engineering</w:t>
       </w:r>
       <w:r>
@@ -185,7 +320,8 @@
           <w:sz w:val="20"/>
           <w:szCs w:val="20"/>
         </w:rPr>
-        <w:t xml:space="preserve">	McLean, VA  |  2023 – Present</w:t>
+        <w:tab/>
+        <w:t>McLean, VA  |  2023 – Nov 2025</w:t>
       </w:r>
     </w:p>
     <w:p>

</xml_diff>